<commit_message>
fix(p4): one «Адрес:» / «Address:» label in invoice addresses
Same rule as CT-1 / Fito: the invoice_ru / invoice_en seller and buyer boxes
(invoice and packing list) print one template label, the label typed into the
firm card is stripped, and a blank address prints no line. Invoice templates
regenerated from build_templates.py.

Co-Authored-By: Claude Opus 5.5 <noreply@anthropic.com>
</commit_message>
<xml_diff>
--- a/backend/apps/contracts/document_templates/invoice_en.docx
+++ b/backend/apps/contracts/document_templates/invoice_en.docx
@@ -124,7 +124,7 @@
               <w:rPr>
                 <w:sz w:val="18"/>
               </w:rPr>
-              <w:t>{{ seller_address }}</w:t>
+              <w:t>{% if seller_address %}Address: {{ seller_address }}{% endif %}</w:t>
             </w:r>
           </w:p>
           <w:p/>
@@ -170,7 +170,7 @@
               <w:rPr>
                 <w:sz w:val="18"/>
               </w:rPr>
-              <w:t>{{ buyer_address }}</w:t>
+              <w:t>{% if buyer_address %}Address: {{ buyer_address }}{% endif %}</w:t>
             </w:r>
           </w:p>
           <w:p/>
@@ -1014,7 +1014,7 @@
               <w:rPr>
                 <w:sz w:val="18"/>
               </w:rPr>
-              <w:t>{{ seller_address }}</w:t>
+              <w:t>{% if seller_address %}Address: {{ seller_address }}{% endif %}</w:t>
             </w:r>
           </w:p>
           <w:p/>
@@ -1060,7 +1060,7 @@
               <w:rPr>
                 <w:sz w:val="18"/>
               </w:rPr>
-              <w:t>{{ buyer_address }}</w:t>
+              <w:t>{% if buyer_address %}Address: {{ buyer_address }}{% endif %}</w:t>
             </w:r>
           </w:p>
           <w:p/>

</xml_diff>